<commit_message>
fix: strip remaining PII from all 104 NDIS template headers/footers
The initial PII scan only processed paragraph-level text nodes via
python-docx's paragraph iterator, missing text inside Word drawing
text boxes embedded in headers and footers. This affected 98 of 104
templates which retained 'Spring 2 Health', the ABN, and in some cases
'Pristine Lifestyle Solutions' in header1.xml / footer1.xml XML parts.

Fix: direct zip-level XML replacement across all header, footer, document
and rels XML parts. All 98 affected docx files patched and PDFs
regenerated. Final scan: CLEAN across all 104 templates.

Co-Authored-By: Claude Sonnet 4.6 <noreply@anthropic.com>
</commit_message>
<xml_diff>
--- a/server/templates/library/administering-medication-checklist-medication-chart/template.docx
+++ b/server/templates/library/administering-medication-checklist-medication-chart/template.docx
@@ -24207,7 +24207,7 @@
               <w:szCs w:val="16"/>
               <w:rtl w:val="0"/>
             </w:rPr>
-            <w:t>The Board of Spring 2 Health Pty Ltd</w:t>
+            <w:t>The Board of {org.legal_name}</w:t>
           </w:r>
           <w:r>
             <w:rPr>
@@ -24549,7 +24549,7 @@
         <w:szCs w:val="28"/>
         <w:rtl w:val="0"/>
       </w:rPr>
-      <w:t>Spring 2 Health ABN 71 665 820 986</w:t>
+      <w:t>{org.name} ABN {org.abn}</w:t>
     </w:r>
   </w:p>
   <w:p>

</xml_diff>